<commit_message>
camara: quita dos referencias al libro que se habían escapado en El diapasón invisible
Segunda pasada de revisión sobre la edición integral: quedaban dos
frases en el movimiento VIII que apuntaban a contenido inexistente en
esta serie ("descrito en otro lugar de este libro", "leída con el
vocabulario de este libro"). Se reescriben para que el párrafo se
sostenga solo, igual que las nueve corregidas en el commit anterior.
Recompila también la edición integral, que incluye ese mismo texto.

Co-Authored-By: Claude Sonnet 5 <noreply@anthropic.com>
Claude-Session: https://claude.ai/code/session_01SDh3ggJbPt4Gq9T1rFFUe6
</commit_message>
<xml_diff>
--- a/camara/EHI_edicion_integral.docx
+++ b/camara/EHI_edicion_integral.docx
@@ -9629,7 +9629,7 @@
           <w:i w:val="0"/>
           <w:sz w:val="22"/>
         </w:rPr>
-        <w:t>Eso es, estructuralmente, lo que hace la oración sostenida. Lo que hace la meditación profunda. Lo que hace el ayuno, el rosario, el mantra, el dhikr, la liturgia cantada en comunidad. La técnica es reconocible en cualquier tradición que se mire de cerca: repetición hasta que el ruido cesa, quietud hasta que el sistema deja de generar predicciones nuevas, ritmo compartido que sincroniza a una comunidad entera en la misma frecuencia. Es el mismo mecanismo que reduce la tasa de integración del horizonte hasta el límite —descrito en otro lugar de este libro con más rigor del que la experiencia necesita para sentirse cierta— donde la fluctuación del sistema se acerca a cero y el campo de fondo, sea lo que sea ese campo, se acerca a todo.</w:t>
+        <w:t>Eso es, estructuralmente, lo que hace la oración sostenida. Lo que hace la meditación profunda. Lo que hace el ayuno, el rosario, el mantra, el dhikr, la liturgia cantada en comunidad. La técnica es reconocible en cualquier tradición que se mire de cerca: repetición hasta que el ruido cesa, quietud hasta que el sistema deja de generar predicciones nuevas, ritmo compartido que sincroniza a una comunidad entera en la misma frecuencia. Es el mismo mecanismo que reduce la tasa de integración del horizonte hasta un límite donde la fluctuación del sistema se acerca a cero y el campo de fondo, sea lo que sea ese campo, se acerca a todo.</w:t>
       </w:r>
     </w:p>
     <w:p>
@@ -10789,7 +10789,7 @@
           <w:i w:val="0"/>
           <w:sz w:val="22"/>
         </w:rPr>
-        <w:t>, de Shūsaku Endō, un misionero jesuita en el Japón del siglo XVII espera durante años una señal de un Dios que no habla mientras los campesinos que convirtió son torturados por su culpa. La novela —y la película de Scorsese que la adaptó fielmente— no es sobre la pérdida de la fe. Es sobre lo que hay que hacer cuando el entrelazamiento vertical se sostiene sin ninguna correlación observable, ni siquiera en el peor momento posible para que falte. La orden final que recibe el sacerdote —pisar la imagen sagrada para salvar vidas— es, leída con el vocabulario de este libro, la pregunta por la ética que el experimento no puede responder llevada a su forma más cruel: ningún «es» —ni el silencio de Dios, ni el sufrimiento de los campesinos— produce por sí solo el «debería» que el protagonista necesita desesperadamente que alguien le confirme.</w:t>
+        <w:t>, de Shūsaku Endō, un misionero jesuita en el Japón del siglo XVII espera durante años una señal de un Dios que no habla mientras los campesinos que convirtió son torturados por su culpa. La novela —y la película de Scorsese que la adaptó fielmente— no es sobre la pérdida de la fe. Es sobre lo que hay que hacer cuando el entrelazamiento vertical se sostiene sin ninguna correlación observable, ni siquiera en el peor momento posible para que falte. La orden final que recibe el sacerdote —pisar la imagen sagrada para salvar vidas— es la pregunta por la ética que el experimento no puede responder, llevada a su forma más cruel: ningún «es» —ni el silencio de Dios, ni el sufrimiento de los campesinos— produce por sí solo el «debería» que el protagonista necesita desesperadamente que alguien le confirme.</w:t>
       </w:r>
     </w:p>
     <w:p>

</xml_diff>